<commit_message>
Make the log-read filter valid when there is nothing to filter on
The conditional filter returned an empty string when neither a state nor a
project was supplied, and SharePoint rejects a blank $filter as firmly as a
malformed one. Pasted across several lines it was worse still: the editor keeps
the line breaks, so the filter arrived as "\n" and came back
'The $filter expression " " is not valid'.

The no-filter case is now 'Id gt 0', which matches every item in any list and
is always valid, and the expression is given as a single line with the reason
why that matters.

All four combinations are worked through in a table rather than left to be
eyeballed — the quoting is three and four single quotes deep in places, and I
have already got it wrong once today by reading rather than checking it.

Co-Authored-By: Claude Opus 5 <noreply@anthropic.com>
Claude-Session: https://claude.ai/code/session_01R3SHvZxDNeDF7H2ECUwwcs
</commit_message>
<xml_diff>
--- a/docs/word/3 - Building the Flows.docx
+++ b/docs/word/3 - Building the Flows.docx
@@ -14422,7 +14422,93 @@
           <w:sz w:val="20"/>
           <w:szCs w:val="20"/>
         </w:rPr>
-        <w:t xml:space="preserve"> with no project in mind. Build the filter so it leaves out the clauses it has no value for. In the </w:t>
+        <w:t xml:space="preserve"> with no project in mind, and SharePoint rejects a </w:t>
+      </w:r>
+      <w:r>
+        <w:rPr>
+          <w:rFonts w:ascii="Arial" w:cs="Arial" w:eastAsia="Arial" w:hAnsi="Arial"/>
+          <w:b/>
+          <w:bCs/>
+          <w:color w:val="1C2B3A"/>
+          <w:sz w:val="20"/>
+          <w:szCs w:val="20"/>
+        </w:rPr>
+        <w:t xml:space="preserve">blank</w:t>
+      </w:r>
+      <w:r>
+        <w:rPr>
+          <w:rFonts w:ascii="Arial" w:cs="Arial" w:eastAsia="Arial" w:hAnsi="Arial"/>
+          <w:color w:val="1C2B3A"/>
+          <w:sz w:val="20"/>
+          <w:szCs w:val="20"/>
+        </w:rPr>
+        <w:t xml:space="preserve"> filter as firmly as a malformed one — even a filter containing just a space or a line break comes back </w:t>
+      </w:r>
+      <w:r>
+        <w:rPr>
+          <w:rFonts w:ascii="Consolas" w:cs="Consolas" w:eastAsia="Consolas" w:hAnsi="Consolas"/>
+          <w:color w:val="2A4258"/>
+          <w:sz w:val="18"/>
+          <w:szCs w:val="18"/>
+          <w:shd w:fill="F2F0EA" w:val="clear"/>
+        </w:rPr>
+        <w:t xml:space="preserve">The $filter expression " " is not valid</w:t>
+      </w:r>
+      <w:r>
+        <w:rPr>
+          <w:rFonts w:ascii="Arial" w:cs="Arial" w:eastAsia="Arial" w:hAnsi="Arial"/>
+          <w:color w:val="1C2B3A"/>
+          <w:sz w:val="20"/>
+          <w:szCs w:val="20"/>
+        </w:rPr>
+        <w:t xml:space="preserve">.</w:t>
+      </w:r>
+    </w:p>
+    <w:p>
+      <w:pPr>
+        <w:spacing w:after="160" w:line="276"/>
+      </w:pPr>
+      <w:r>
+        <w:rPr>
+          <w:rFonts w:ascii="Arial" w:cs="Arial" w:eastAsia="Arial" w:hAnsi="Arial"/>
+          <w:color w:val="1C2B3A"/>
+          <w:sz w:val="20"/>
+          <w:szCs w:val="20"/>
+        </w:rPr>
+        <w:t xml:space="preserve">So the expression has to produce a valid filter in all four cases, including the one where it has nothing to filter on. </w:t>
+      </w:r>
+      <w:r>
+        <w:rPr>
+          <w:rFonts w:ascii="Consolas" w:cs="Consolas" w:eastAsia="Consolas" w:hAnsi="Consolas"/>
+          <w:color w:val="2A4258"/>
+          <w:sz w:val="18"/>
+          <w:szCs w:val="18"/>
+          <w:shd w:fill="F2F0EA" w:val="clear"/>
+        </w:rPr>
+        <w:t xml:space="preserve">Id gt 0</w:t>
+      </w:r>
+      <w:r>
+        <w:rPr>
+          <w:rFonts w:ascii="Arial" w:cs="Arial" w:eastAsia="Arial" w:hAnsi="Arial"/>
+          <w:color w:val="1C2B3A"/>
+          <w:sz w:val="20"/>
+          <w:szCs w:val="20"/>
+        </w:rPr>
+        <w:t xml:space="preserve"> matches every item in any list, so it stands in for "no filter".</w:t>
+      </w:r>
+    </w:p>
+    <w:p>
+      <w:pPr>
+        <w:spacing w:after="160" w:line="276"/>
+      </w:pPr>
+      <w:r>
+        <w:rPr>
+          <w:rFonts w:ascii="Arial" w:cs="Arial" w:eastAsia="Arial" w:hAnsi="Arial"/>
+          <w:color w:val="1C2B3A"/>
+          <w:sz w:val="20"/>
+          <w:szCs w:val="20"/>
+        </w:rPr>
+        <w:t xml:space="preserve">In the </w:t>
       </w:r>
       <w:r>
         <w:rPr>
@@ -14442,7 +14528,27 @@
           <w:sz w:val="20"/>
           <w:szCs w:val="20"/>
         </w:rPr>
-        <w:t xml:space="preserve"> box, switch to the expression editor and paste:</w:t>
+        <w:t xml:space="preserve"> box, switch to the expression editor, delete whatever is in there, and paste this </w:t>
+      </w:r>
+      <w:r>
+        <w:rPr>
+          <w:rFonts w:ascii="Arial" w:cs="Arial" w:eastAsia="Arial" w:hAnsi="Arial"/>
+          <w:b/>
+          <w:bCs/>
+          <w:color w:val="1C2B3A"/>
+          <w:sz w:val="20"/>
+          <w:szCs w:val="20"/>
+        </w:rPr>
+        <w:t xml:space="preserve">as one line</w:t>
+      </w:r>
+      <w:r>
+        <w:rPr>
+          <w:rFonts w:ascii="Arial" w:cs="Arial" w:eastAsia="Arial" w:hAnsi="Arial"/>
+          <w:color w:val="1C2B3A"/>
+          <w:sz w:val="20"/>
+          <w:szCs w:val="20"/>
+        </w:rPr>
+        <w:t xml:space="preserve">:</w:t>
       </w:r>
     </w:p>
     <w:p>
@@ -14451,7 +14557,7 @@
           <w:left w:val="single" w:color="4C5C6D" w:sz="12" w:space="8"/>
         </w:pBdr>
         <w:shd w:fill="F2F0EA" w:val="clear"/>
-        <w:spacing w:after="0" w:before="120"/>
+        <w:spacing w:after="160" w:before="120"/>
         <w:ind w:left="220" w:right="220"/>
       </w:pPr>
       <w:r>
@@ -14461,236 +14567,510 @@
           <w:sz w:val="17"/>
           <w:szCs w:val="17"/>
         </w:rPr>
-        <w:t xml:space="preserve">if(</w:t>
-      </w:r>
-    </w:p>
-    <w:p>
-      <w:pPr>
-        <w:pBdr>
-          <w:left w:val="single" w:color="4C5C6D" w:sz="12" w:space="8"/>
-        </w:pBdr>
-        <w:shd w:fill="F2F0EA" w:val="clear"/>
-        <w:spacing w:after="0" w:before="0"/>
-        <w:ind w:left="220" w:right="220"/>
-      </w:pPr>
-      <w:r>
-        <w:rPr>
-          <w:rFonts w:ascii="Consolas" w:cs="Consolas" w:eastAsia="Consolas" w:hAnsi="Consolas"/>
-          <w:color w:val="1C2B3A"/>
-          <w:sz w:val="17"/>
-          <w:szCs w:val="17"/>
-        </w:rPr>
-        <w:t xml:space="preserve">  and(empty(outputs('Payload')?['state']), empty(outputs('Payload')?['projectId'])),</w:t>
-      </w:r>
-    </w:p>
-    <w:p>
-      <w:pPr>
-        <w:pBdr>
-          <w:left w:val="single" w:color="4C5C6D" w:sz="12" w:space="8"/>
-        </w:pBdr>
-        <w:shd w:fill="F2F0EA" w:val="clear"/>
-        <w:spacing w:after="0" w:before="0"/>
-        <w:ind w:left="220" w:right="220"/>
-      </w:pPr>
-      <w:r>
-        <w:rPr>
-          <w:rFonts w:ascii="Consolas" w:cs="Consolas" w:eastAsia="Consolas" w:hAnsi="Consolas"/>
-          <w:color w:val="1C2B3A"/>
-          <w:sz w:val="17"/>
-          <w:szCs w:val="17"/>
-        </w:rPr>
-        <w:t xml:space="preserve">  '',</w:t>
-      </w:r>
-    </w:p>
-    <w:p>
-      <w:pPr>
-        <w:pBdr>
-          <w:left w:val="single" w:color="4C5C6D" w:sz="12" w:space="8"/>
-        </w:pBdr>
-        <w:shd w:fill="F2F0EA" w:val="clear"/>
-        <w:spacing w:after="0" w:before="0"/>
-        <w:ind w:left="220" w:right="220"/>
-      </w:pPr>
-      <w:r>
-        <w:rPr>
-          <w:rFonts w:ascii="Consolas" w:cs="Consolas" w:eastAsia="Consolas" w:hAnsi="Consolas"/>
-          <w:color w:val="1C2B3A"/>
-          <w:sz w:val="17"/>
-          <w:szCs w:val="17"/>
-        </w:rPr>
-        <w:t xml:space="preserve">  if(</w:t>
-      </w:r>
-    </w:p>
-    <w:p>
-      <w:pPr>
-        <w:pBdr>
-          <w:left w:val="single" w:color="4C5C6D" w:sz="12" w:space="8"/>
-        </w:pBdr>
-        <w:shd w:fill="F2F0EA" w:val="clear"/>
-        <w:spacing w:after="0" w:before="0"/>
-        <w:ind w:left="220" w:right="220"/>
-      </w:pPr>
-      <w:r>
-        <w:rPr>
-          <w:rFonts w:ascii="Consolas" w:cs="Consolas" w:eastAsia="Consolas" w:hAnsi="Consolas"/>
-          <w:color w:val="1C2B3A"/>
-          <w:sz w:val="17"/>
-          <w:szCs w:val="17"/>
-        </w:rPr>
-        <w:t xml:space="preserve">    empty(outputs('Payload')?['projectId']),</w:t>
-      </w:r>
-    </w:p>
-    <w:p>
-      <w:pPr>
-        <w:pBdr>
-          <w:left w:val="single" w:color="4C5C6D" w:sz="12" w:space="8"/>
-        </w:pBdr>
-        <w:shd w:fill="F2F0EA" w:val="clear"/>
-        <w:spacing w:after="0" w:before="0"/>
-        <w:ind w:left="220" w:right="220"/>
-      </w:pPr>
-      <w:r>
-        <w:rPr>
-          <w:rFonts w:ascii="Consolas" w:cs="Consolas" w:eastAsia="Consolas" w:hAnsi="Consolas"/>
-          <w:color w:val="1C2B3A"/>
-          <w:sz w:val="17"/>
-          <w:szCs w:val="17"/>
-        </w:rPr>
-        <w:t xml:space="preserve">    concat('State eq ''', outputs('Payload')?['state'], ''''),</w:t>
-      </w:r>
-    </w:p>
-    <w:p>
-      <w:pPr>
-        <w:pBdr>
-          <w:left w:val="single" w:color="4C5C6D" w:sz="12" w:space="8"/>
-        </w:pBdr>
-        <w:shd w:fill="F2F0EA" w:val="clear"/>
-        <w:spacing w:after="0" w:before="0"/>
-        <w:ind w:left="220" w:right="220"/>
-      </w:pPr>
-      <w:r>
-        <w:rPr>
-          <w:rFonts w:ascii="Consolas" w:cs="Consolas" w:eastAsia="Consolas" w:hAnsi="Consolas"/>
-          <w:color w:val="1C2B3A"/>
-          <w:sz w:val="17"/>
-          <w:szCs w:val="17"/>
-        </w:rPr>
-        <w:t xml:space="preserve">    if(</w:t>
-      </w:r>
-    </w:p>
-    <w:p>
-      <w:pPr>
-        <w:pBdr>
-          <w:left w:val="single" w:color="4C5C6D" w:sz="12" w:space="8"/>
-        </w:pBdr>
-        <w:shd w:fill="F2F0EA" w:val="clear"/>
-        <w:spacing w:after="0" w:before="0"/>
-        <w:ind w:left="220" w:right="220"/>
-      </w:pPr>
-      <w:r>
-        <w:rPr>
-          <w:rFonts w:ascii="Consolas" w:cs="Consolas" w:eastAsia="Consolas" w:hAnsi="Consolas"/>
-          <w:color w:val="1C2B3A"/>
-          <w:sz w:val="17"/>
-          <w:szCs w:val="17"/>
-        </w:rPr>
-        <w:t xml:space="preserve">      empty(outputs('Payload')?['state']),</w:t>
-      </w:r>
-    </w:p>
-    <w:p>
-      <w:pPr>
-        <w:pBdr>
-          <w:left w:val="single" w:color="4C5C6D" w:sz="12" w:space="8"/>
-        </w:pBdr>
-        <w:shd w:fill="F2F0EA" w:val="clear"/>
-        <w:spacing w:after="0" w:before="0"/>
-        <w:ind w:left="220" w:right="220"/>
-      </w:pPr>
-      <w:r>
-        <w:rPr>
-          <w:rFonts w:ascii="Consolas" w:cs="Consolas" w:eastAsia="Consolas" w:hAnsi="Consolas"/>
-          <w:color w:val="1C2B3A"/>
-          <w:sz w:val="17"/>
-          <w:szCs w:val="17"/>
-        </w:rPr>
-        <w:t xml:space="preserve">      concat('ProjectId eq ', outputs('Payload')?['projectId']),</w:t>
-      </w:r>
-    </w:p>
-    <w:p>
-      <w:pPr>
-        <w:pBdr>
-          <w:left w:val="single" w:color="4C5C6D" w:sz="12" w:space="8"/>
-        </w:pBdr>
-        <w:shd w:fill="F2F0EA" w:val="clear"/>
-        <w:spacing w:after="0" w:before="0"/>
-        <w:ind w:left="220" w:right="220"/>
-      </w:pPr>
-      <w:r>
-        <w:rPr>
-          <w:rFonts w:ascii="Consolas" w:cs="Consolas" w:eastAsia="Consolas" w:hAnsi="Consolas"/>
-          <w:color w:val="1C2B3A"/>
-          <w:sz w:val="17"/>
-          <w:szCs w:val="17"/>
-        </w:rPr>
-        <w:t xml:space="preserve">      concat('State eq ''', outputs('Payload')?['state'], ''' and ProjectId eq ', outputs('Payload')?['projectId'])</w:t>
-      </w:r>
-    </w:p>
-    <w:p>
-      <w:pPr>
-        <w:pBdr>
-          <w:left w:val="single" w:color="4C5C6D" w:sz="12" w:space="8"/>
-        </w:pBdr>
-        <w:shd w:fill="F2F0EA" w:val="clear"/>
-        <w:spacing w:after="0" w:before="0"/>
-        <w:ind w:left="220" w:right="220"/>
-      </w:pPr>
-      <w:r>
-        <w:rPr>
-          <w:rFonts w:ascii="Consolas" w:cs="Consolas" w:eastAsia="Consolas" w:hAnsi="Consolas"/>
-          <w:color w:val="1C2B3A"/>
-          <w:sz w:val="17"/>
-          <w:szCs w:val="17"/>
-        </w:rPr>
-        <w:t xml:space="preserve">    )</w:t>
-      </w:r>
-    </w:p>
-    <w:p>
-      <w:pPr>
-        <w:pBdr>
-          <w:left w:val="single" w:color="4C5C6D" w:sz="12" w:space="8"/>
-        </w:pBdr>
-        <w:shd w:fill="F2F0EA" w:val="clear"/>
-        <w:spacing w:after="0" w:before="0"/>
-        <w:ind w:left="220" w:right="220"/>
-      </w:pPr>
-      <w:r>
-        <w:rPr>
-          <w:rFonts w:ascii="Consolas" w:cs="Consolas" w:eastAsia="Consolas" w:hAnsi="Consolas"/>
-          <w:color w:val="1C2B3A"/>
-          <w:sz w:val="17"/>
-          <w:szCs w:val="17"/>
-        </w:rPr>
-        <w:t xml:space="preserve">  )</w:t>
-      </w:r>
-    </w:p>
-    <w:p>
-      <w:pPr>
-        <w:pBdr>
-          <w:left w:val="single" w:color="4C5C6D" w:sz="12" w:space="8"/>
-        </w:pBdr>
-        <w:shd w:fill="F2F0EA" w:val="clear"/>
-        <w:spacing w:after="160" w:before="0"/>
-        <w:ind w:left="220" w:right="220"/>
-      </w:pPr>
-      <w:r>
-        <w:rPr>
-          <w:rFonts w:ascii="Consolas" w:cs="Consolas" w:eastAsia="Consolas" w:hAnsi="Consolas"/>
-          <w:color w:val="1C2B3A"/>
-          <w:sz w:val="17"/>
-          <w:szCs w:val="17"/>
-        </w:rPr>
-        <w:t xml:space="preserve">)</w:t>
-      </w:r>
+        <w:t xml:space="preserve">if(and(empty(outputs('Payload')?['state']),empty(outputs('Payload')?['projectId'])),'Id gt 0',if(empty(outputs('Payload')?['projectId']),concat('State eq ''',outputs('Payload')?['state'],''''),if(empty(outputs('Payload')?['state']),concat('ProjectId eq ',outputs('Payload')?['projectId']),concat('State eq ''',outputs('Payload')?['state'],''' and ProjectId eq ',outputs('Payload')?['projectId']))))</w:t>
+      </w:r>
+    </w:p>
+    <w:p>
+      <w:pPr>
+        <w:spacing w:after="160" w:line="276"/>
+      </w:pPr>
+      <w:r>
+        <w:rPr>
+          <w:rFonts w:ascii="Arial" w:cs="Arial" w:eastAsia="Arial" w:hAnsi="Arial"/>
+          <w:b/>
+          <w:bCs/>
+          <w:color w:val="1C2B3A"/>
+          <w:sz w:val="20"/>
+          <w:szCs w:val="20"/>
+        </w:rPr>
+        <w:t xml:space="preserve">Paste it as a single line.</w:t>
+      </w:r>
+      <w:r>
+        <w:rPr>
+          <w:rFonts w:ascii="Arial" w:cs="Arial" w:eastAsia="Arial" w:hAnsi="Arial"/>
+          <w:color w:val="1C2B3A"/>
+          <w:sz w:val="20"/>
+          <w:szCs w:val="20"/>
+        </w:rPr>
+        <w:t xml:space="preserve"> Pasting it across several lines is what produced the </w:t>
+      </w:r>
+      <w:r>
+        <w:rPr>
+          <w:rFonts w:ascii="Consolas" w:cs="Consolas" w:eastAsia="Consolas" w:hAnsi="Consolas"/>
+          <w:color w:val="2A4258"/>
+          <w:sz w:val="18"/>
+          <w:szCs w:val="18"/>
+          <w:shd w:fill="F2F0EA" w:val="clear"/>
+        </w:rPr>
+        <w:t xml:space="preserve">"\n"</w:t>
+      </w:r>
+      <w:r>
+        <w:rPr>
+          <w:rFonts w:ascii="Arial" w:cs="Arial" w:eastAsia="Arial" w:hAnsi="Arial"/>
+          <w:color w:val="1C2B3A"/>
+          <w:sz w:val="20"/>
+          <w:szCs w:val="20"/>
+        </w:rPr>
+        <w:t xml:space="preserve"> filter: the editor keeps the line breaks, and the result is whitespace rather than a filter.</w:t>
+      </w:r>
+    </w:p>
+    <w:p>
+      <w:pPr>
+        <w:spacing w:after="160" w:line="276"/>
+      </w:pPr>
+      <w:r>
+        <w:rPr>
+          <w:rFonts w:ascii="Arial" w:cs="Arial" w:eastAsia="Arial" w:hAnsi="Arial"/>
+          <w:color w:val="1C2B3A"/>
+          <w:sz w:val="20"/>
+          <w:szCs w:val="20"/>
+        </w:rPr>
+        <w:t xml:space="preserve">What it produces:</w:t>
+      </w:r>
+    </w:p>
+    <w:tbl>
+      <w:tblPr>
+        <w:tblW w:type="dxa" w:w="9026"/>
+        <w:tblBorders>
+          <w:top w:val="single" w:color="C9C2B4" w:sz="4"/>
+          <w:left w:val="single" w:color="C9C2B4" w:sz="4"/>
+          <w:bottom w:val="single" w:color="C9C2B4" w:sz="4"/>
+          <w:right w:val="single" w:color="C9C2B4" w:sz="4"/>
+          <w:insideH w:val="single" w:color="C9C2B4" w:sz="4"/>
+          <w:insideV w:val="single" w:color="C9C2B4" w:sz="4"/>
+        </w:tblBorders>
+      </w:tblPr>
+      <w:tblGrid>
+        <w:gridCol w:w="1532"/>
+        <w:gridCol w:w="1532"/>
+        <w:gridCol w:w="5962"/>
+      </w:tblGrid>
+      <w:tr>
+        <w:trPr>
+          <w:tblHeader/>
+        </w:trPr>
+        <w:tc>
+          <w:tcPr>
+            <w:tcW w:type="dxa" w:w="1532"/>
+            <w:shd w:fill="4C5C6D" w:val="clear"/>
+            <w:tcMar>
+              <w:top w:type="dxa" w:w="60"/>
+              <w:left w:type="dxa" w:w="110"/>
+              <w:bottom w:type="dxa" w:w="60"/>
+              <w:right w:type="dxa" w:w="110"/>
+            </w:tcMar>
+          </w:tcPr>
+          <w:p>
+            <w:pPr>
+              <w:spacing w:after="0" w:before="0"/>
+            </w:pPr>
+            <w:r>
+              <w:rPr>
+                <w:rFonts w:ascii="Arial" w:cs="Arial" w:eastAsia="Arial" w:hAnsi="Arial"/>
+                <w:b/>
+                <w:bCs/>
+                <w:color w:val="FFFFFF"/>
+                <w:sz w:val="18"/>
+                <w:szCs w:val="18"/>
+              </w:rPr>
+              <w:t xml:space="preserve">state</w:t>
+            </w:r>
+          </w:p>
+        </w:tc>
+        <w:tc>
+          <w:tcPr>
+            <w:tcW w:type="dxa" w:w="1532"/>
+            <w:shd w:fill="4C5C6D" w:val="clear"/>
+            <w:tcMar>
+              <w:top w:type="dxa" w:w="60"/>
+              <w:left w:type="dxa" w:w="110"/>
+              <w:bottom w:type="dxa" w:w="60"/>
+              <w:right w:type="dxa" w:w="110"/>
+            </w:tcMar>
+          </w:tcPr>
+          <w:p>
+            <w:pPr>
+              <w:spacing w:after="0" w:before="0"/>
+            </w:pPr>
+            <w:r>
+              <w:rPr>
+                <w:rFonts w:ascii="Arial" w:cs="Arial" w:eastAsia="Arial" w:hAnsi="Arial"/>
+                <w:b/>
+                <w:bCs/>
+                <w:color w:val="FFFFFF"/>
+                <w:sz w:val="18"/>
+                <w:szCs w:val="18"/>
+              </w:rPr>
+              <w:t xml:space="preserve">projectId</w:t>
+            </w:r>
+          </w:p>
+        </w:tc>
+        <w:tc>
+          <w:tcPr>
+            <w:tcW w:type="dxa" w:w="5962"/>
+            <w:shd w:fill="4C5C6D" w:val="clear"/>
+            <w:tcMar>
+              <w:top w:type="dxa" w:w="60"/>
+              <w:left w:type="dxa" w:w="110"/>
+              <w:bottom w:type="dxa" w:w="60"/>
+              <w:right w:type="dxa" w:w="110"/>
+            </w:tcMar>
+          </w:tcPr>
+          <w:p>
+            <w:pPr>
+              <w:spacing w:after="0" w:before="0"/>
+            </w:pPr>
+            <w:r>
+              <w:rPr>
+                <w:rFonts w:ascii="Arial" w:cs="Arial" w:eastAsia="Arial" w:hAnsi="Arial"/>
+                <w:b/>
+                <w:bCs/>
+                <w:color w:val="FFFFFF"/>
+                <w:sz w:val="18"/>
+                <w:szCs w:val="18"/>
+              </w:rPr>
+              <w:t xml:space="preserve">$filter</w:t>
+            </w:r>
+          </w:p>
+        </w:tc>
+      </w:tr>
+      <w:tr>
+        <w:tc>
+          <w:tcPr>
+            <w:tcW w:type="dxa" w:w="1532"/>
+            <w:shd w:fill="FFFFFF" w:val="clear"/>
+            <w:tcMar>
+              <w:top w:type="dxa" w:w="60"/>
+              <w:left w:type="dxa" w:w="110"/>
+              <w:bottom w:type="dxa" w:w="60"/>
+              <w:right w:type="dxa" w:w="110"/>
+            </w:tcMar>
+          </w:tcPr>
+          <w:p>
+            <w:pPr>
+              <w:spacing w:after="0" w:before="0"/>
+            </w:pPr>
+            <w:r>
+              <w:rPr>
+                <w:rFonts w:ascii="Arial" w:cs="Arial" w:eastAsia="Arial" w:hAnsi="Arial"/>
+                <w:color w:val="1C2B3A"/>
+                <w:sz w:val="18"/>
+                <w:szCs w:val="18"/>
+              </w:rPr>
+              <w:t xml:space="preserve">VIC</w:t>
+            </w:r>
+          </w:p>
+        </w:tc>
+        <w:tc>
+          <w:tcPr>
+            <w:tcW w:type="dxa" w:w="1532"/>
+            <w:shd w:fill="FFFFFF" w:val="clear"/>
+            <w:tcMar>
+              <w:top w:type="dxa" w:w="60"/>
+              <w:left w:type="dxa" w:w="110"/>
+              <w:bottom w:type="dxa" w:w="60"/>
+              <w:right w:type="dxa" w:w="110"/>
+            </w:tcMar>
+          </w:tcPr>
+          <w:p>
+            <w:pPr>
+              <w:spacing w:after="0" w:before="0"/>
+            </w:pPr>
+            <w:r>
+              <w:rPr>
+                <w:rFonts w:ascii="Arial" w:cs="Arial" w:eastAsia="Arial" w:hAnsi="Arial"/>
+                <w:color w:val="1C2B3A"/>
+                <w:sz w:val="18"/>
+                <w:szCs w:val="18"/>
+              </w:rPr>
+              <w:t xml:space="preserve">7</w:t>
+            </w:r>
+          </w:p>
+        </w:tc>
+        <w:tc>
+          <w:tcPr>
+            <w:tcW w:type="dxa" w:w="5962"/>
+            <w:shd w:fill="FFFFFF" w:val="clear"/>
+            <w:tcMar>
+              <w:top w:type="dxa" w:w="60"/>
+              <w:left w:type="dxa" w:w="110"/>
+              <w:bottom w:type="dxa" w:w="60"/>
+              <w:right w:type="dxa" w:w="110"/>
+            </w:tcMar>
+          </w:tcPr>
+          <w:p>
+            <w:pPr>
+              <w:spacing w:after="0" w:before="0"/>
+            </w:pPr>
+            <w:r>
+              <w:rPr>
+                <w:rFonts w:ascii="Consolas" w:cs="Consolas" w:eastAsia="Consolas" w:hAnsi="Consolas"/>
+                <w:color w:val="2A4258"/>
+                <w:sz w:val="16"/>
+                <w:szCs w:val="16"/>
+                <w:shd w:fill="F2F0EA" w:val="clear"/>
+              </w:rPr>
+              <w:t xml:space="preserve">State eq 'VIC' and ProjectId eq 7</w:t>
+            </w:r>
+          </w:p>
+        </w:tc>
+      </w:tr>
+      <w:tr>
+        <w:tc>
+          <w:tcPr>
+            <w:tcW w:type="dxa" w:w="1532"/>
+            <w:shd w:fill="FFFFFF" w:val="clear"/>
+            <w:tcMar>
+              <w:top w:type="dxa" w:w="60"/>
+              <w:left w:type="dxa" w:w="110"/>
+              <w:bottom w:type="dxa" w:w="60"/>
+              <w:right w:type="dxa" w:w="110"/>
+            </w:tcMar>
+          </w:tcPr>
+          <w:p>
+            <w:pPr>
+              <w:spacing w:after="0" w:before="0"/>
+            </w:pPr>
+            <w:r>
+              <w:rPr>
+                <w:rFonts w:ascii="Arial" w:cs="Arial" w:eastAsia="Arial" w:hAnsi="Arial"/>
+                <w:color w:val="1C2B3A"/>
+                <w:sz w:val="18"/>
+                <w:szCs w:val="18"/>
+              </w:rPr>
+              <w:t xml:space="preserve">VIC</w:t>
+            </w:r>
+          </w:p>
+        </w:tc>
+        <w:tc>
+          <w:tcPr>
+            <w:tcW w:type="dxa" w:w="1532"/>
+            <w:shd w:fill="FFFFFF" w:val="clear"/>
+            <w:tcMar>
+              <w:top w:type="dxa" w:w="60"/>
+              <w:left w:type="dxa" w:w="110"/>
+              <w:bottom w:type="dxa" w:w="60"/>
+              <w:right w:type="dxa" w:w="110"/>
+            </w:tcMar>
+          </w:tcPr>
+          <w:p>
+            <w:pPr>
+              <w:spacing w:after="0" w:before="0"/>
+            </w:pPr>
+            <w:r>
+              <w:rPr>
+                <w:rFonts w:ascii="Arial" w:cs="Arial" w:eastAsia="Arial" w:hAnsi="Arial"/>
+                <w:i/>
+                <w:iCs/>
+                <w:color w:val="1C2B3A"/>
+                <w:sz w:val="18"/>
+                <w:szCs w:val="18"/>
+              </w:rPr>
+              <w:t xml:space="preserve">(empty)</w:t>
+            </w:r>
+          </w:p>
+        </w:tc>
+        <w:tc>
+          <w:tcPr>
+            <w:tcW w:type="dxa" w:w="5962"/>
+            <w:shd w:fill="FFFFFF" w:val="clear"/>
+            <w:tcMar>
+              <w:top w:type="dxa" w:w="60"/>
+              <w:left w:type="dxa" w:w="110"/>
+              <w:bottom w:type="dxa" w:w="60"/>
+              <w:right w:type="dxa" w:w="110"/>
+            </w:tcMar>
+          </w:tcPr>
+          <w:p>
+            <w:pPr>
+              <w:spacing w:after="0" w:before="0"/>
+            </w:pPr>
+            <w:r>
+              <w:rPr>
+                <w:rFonts w:ascii="Consolas" w:cs="Consolas" w:eastAsia="Consolas" w:hAnsi="Consolas"/>
+                <w:color w:val="2A4258"/>
+                <w:sz w:val="16"/>
+                <w:szCs w:val="16"/>
+                <w:shd w:fill="F2F0EA" w:val="clear"/>
+              </w:rPr>
+              <w:t xml:space="preserve">State eq 'VIC'</w:t>
+            </w:r>
+          </w:p>
+        </w:tc>
+      </w:tr>
+      <w:tr>
+        <w:tc>
+          <w:tcPr>
+            <w:tcW w:type="dxa" w:w="1532"/>
+            <w:shd w:fill="FFFFFF" w:val="clear"/>
+            <w:tcMar>
+              <w:top w:type="dxa" w:w="60"/>
+              <w:left w:type="dxa" w:w="110"/>
+              <w:bottom w:type="dxa" w:w="60"/>
+              <w:right w:type="dxa" w:w="110"/>
+            </w:tcMar>
+          </w:tcPr>
+          <w:p>
+            <w:pPr>
+              <w:spacing w:after="0" w:before="0"/>
+            </w:pPr>
+            <w:r>
+              <w:rPr>
+                <w:rFonts w:ascii="Arial" w:cs="Arial" w:eastAsia="Arial" w:hAnsi="Arial"/>
+                <w:i/>
+                <w:iCs/>
+                <w:color w:val="1C2B3A"/>
+                <w:sz w:val="18"/>
+                <w:szCs w:val="18"/>
+              </w:rPr>
+              <w:t xml:space="preserve">(empty)</w:t>
+            </w:r>
+          </w:p>
+        </w:tc>
+        <w:tc>
+          <w:tcPr>
+            <w:tcW w:type="dxa" w:w="1532"/>
+            <w:shd w:fill="FFFFFF" w:val="clear"/>
+            <w:tcMar>
+              <w:top w:type="dxa" w:w="60"/>
+              <w:left w:type="dxa" w:w="110"/>
+              <w:bottom w:type="dxa" w:w="60"/>
+              <w:right w:type="dxa" w:w="110"/>
+            </w:tcMar>
+          </w:tcPr>
+          <w:p>
+            <w:pPr>
+              <w:spacing w:after="0" w:before="0"/>
+            </w:pPr>
+            <w:r>
+              <w:rPr>
+                <w:rFonts w:ascii="Arial" w:cs="Arial" w:eastAsia="Arial" w:hAnsi="Arial"/>
+                <w:color w:val="1C2B3A"/>
+                <w:sz w:val="18"/>
+                <w:szCs w:val="18"/>
+              </w:rPr>
+              <w:t xml:space="preserve">7</w:t>
+            </w:r>
+          </w:p>
+        </w:tc>
+        <w:tc>
+          <w:tcPr>
+            <w:tcW w:type="dxa" w:w="5962"/>
+            <w:shd w:fill="FFFFFF" w:val="clear"/>
+            <w:tcMar>
+              <w:top w:type="dxa" w:w="60"/>
+              <w:left w:type="dxa" w:w="110"/>
+              <w:bottom w:type="dxa" w:w="60"/>
+              <w:right w:type="dxa" w:w="110"/>
+            </w:tcMar>
+          </w:tcPr>
+          <w:p>
+            <w:pPr>
+              <w:spacing w:after="0" w:before="0"/>
+            </w:pPr>
+            <w:r>
+              <w:rPr>
+                <w:rFonts w:ascii="Consolas" w:cs="Consolas" w:eastAsia="Consolas" w:hAnsi="Consolas"/>
+                <w:color w:val="2A4258"/>
+                <w:sz w:val="16"/>
+                <w:szCs w:val="16"/>
+                <w:shd w:fill="F2F0EA" w:val="clear"/>
+              </w:rPr>
+              <w:t xml:space="preserve">ProjectId eq 7</w:t>
+            </w:r>
+          </w:p>
+        </w:tc>
+      </w:tr>
+      <w:tr>
+        <w:tc>
+          <w:tcPr>
+            <w:tcW w:type="dxa" w:w="1532"/>
+            <w:shd w:fill="FFFFFF" w:val="clear"/>
+            <w:tcMar>
+              <w:top w:type="dxa" w:w="60"/>
+              <w:left w:type="dxa" w:w="110"/>
+              <w:bottom w:type="dxa" w:w="60"/>
+              <w:right w:type="dxa" w:w="110"/>
+            </w:tcMar>
+          </w:tcPr>
+          <w:p>
+            <w:pPr>
+              <w:spacing w:after="0" w:before="0"/>
+            </w:pPr>
+            <w:r>
+              <w:rPr>
+                <w:rFonts w:ascii="Arial" w:cs="Arial" w:eastAsia="Arial" w:hAnsi="Arial"/>
+                <w:i/>
+                <w:iCs/>
+                <w:color w:val="1C2B3A"/>
+                <w:sz w:val="18"/>
+                <w:szCs w:val="18"/>
+              </w:rPr>
+              <w:t xml:space="preserve">(empty)</w:t>
+            </w:r>
+          </w:p>
+        </w:tc>
+        <w:tc>
+          <w:tcPr>
+            <w:tcW w:type="dxa" w:w="1532"/>
+            <w:shd w:fill="FFFFFF" w:val="clear"/>
+            <w:tcMar>
+              <w:top w:type="dxa" w:w="60"/>
+              <w:left w:type="dxa" w:w="110"/>
+              <w:bottom w:type="dxa" w:w="60"/>
+              <w:right w:type="dxa" w:w="110"/>
+            </w:tcMar>
+          </w:tcPr>
+          <w:p>
+            <w:pPr>
+              <w:spacing w:after="0" w:before="0"/>
+            </w:pPr>
+            <w:r>
+              <w:rPr>
+                <w:rFonts w:ascii="Arial" w:cs="Arial" w:eastAsia="Arial" w:hAnsi="Arial"/>
+                <w:i/>
+                <w:iCs/>
+                <w:color w:val="1C2B3A"/>
+                <w:sz w:val="18"/>
+                <w:szCs w:val="18"/>
+              </w:rPr>
+              <w:t xml:space="preserve">(empty)</w:t>
+            </w:r>
+          </w:p>
+        </w:tc>
+        <w:tc>
+          <w:tcPr>
+            <w:tcW w:type="dxa" w:w="5962"/>
+            <w:shd w:fill="FFFFFF" w:val="clear"/>
+            <w:tcMar>
+              <w:top w:type="dxa" w:w="60"/>
+              <w:left w:type="dxa" w:w="110"/>
+              <w:bottom w:type="dxa" w:w="60"/>
+              <w:right w:type="dxa" w:w="110"/>
+            </w:tcMar>
+          </w:tcPr>
+          <w:p>
+            <w:pPr>
+              <w:spacing w:after="0" w:before="0"/>
+            </w:pPr>
+            <w:r>
+              <w:rPr>
+                <w:rFonts w:ascii="Consolas" w:cs="Consolas" w:eastAsia="Consolas" w:hAnsi="Consolas"/>
+                <w:color w:val="2A4258"/>
+                <w:sz w:val="16"/>
+                <w:szCs w:val="16"/>
+                <w:shd w:fill="F2F0EA" w:val="clear"/>
+              </w:rPr>
+              <w:t xml:space="preserve">Id gt 0</w:t>
+            </w:r>
+          </w:p>
+        </w:tc>
+      </w:tr>
+    </w:tbl>
+    <w:p>
+      <w:pPr>
+        <w:spacing w:after="200"/>
+      </w:pPr>
     </w:p>
     <w:p>
       <w:pPr>
@@ -14892,45 +15272,7 @@
           <w:sz w:val="20"/>
           <w:szCs w:val="20"/>
         </w:rPr>
-        <w:t xml:space="preserve">The quadrupled quotes are not a typo. A single quote inside a Power Automate string literal is written by doubling it, so </w:t>
-      </w:r>
-      <w:r>
-        <w:rPr>
-          <w:rFonts w:ascii="Consolas" w:cs="Consolas" w:eastAsia="Consolas" w:hAnsi="Consolas"/>
-          <w:color w:val="2A4258"/>
-          <w:sz w:val="18"/>
-          <w:szCs w:val="18"/>
-          <w:shd w:fill="F2F0EA" w:val="clear"/>
-        </w:rPr>
-        <w:t xml:space="preserve">''''</w:t>
-      </w:r>
-      <w:r>
-        <w:rPr>
-          <w:rFonts w:ascii="Arial" w:cs="Arial" w:eastAsia="Arial" w:hAnsi="Arial"/>
-          <w:color w:val="1C2B3A"/>
-          <w:sz w:val="20"/>
-          <w:szCs w:val="20"/>
-        </w:rPr>
-        <w:t xml:space="preserve"> produces one </w:t>
-      </w:r>
-      <w:r>
-        <w:rPr>
-          <w:rFonts w:ascii="Consolas" w:cs="Consolas" w:eastAsia="Consolas" w:hAnsi="Consolas"/>
-          <w:color w:val="2A4258"/>
-          <w:sz w:val="18"/>
-          <w:szCs w:val="18"/>
-          <w:shd w:fill="F2F0EA" w:val="clear"/>
-        </w:rPr>
-        <w:t xml:space="preserve">'</w:t>
-      </w:r>
-      <w:r>
-        <w:rPr>
-          <w:rFonts w:ascii="Arial" w:cs="Arial" w:eastAsia="Arial" w:hAnsi="Arial"/>
-          <w:color w:val="1C2B3A"/>
-          <w:sz w:val="20"/>
-          <w:szCs w:val="20"/>
-        </w:rPr>
-        <w:t xml:space="preserve">.</w:t>
+        <w:t xml:space="preserve">The tripled and quadrupled quotes are not a typo. A single quote inside a Power Automate string literal is written by doubling it.</w:t>
       </w:r>
     </w:p>
     <w:p>

</xml_diff>

<commit_message>
Write the filter out properly instead of in shorthand
The guide showed the working filter as

    State eq '@{...state}' and ProjectId eq @{...projectId}

where "...state" meant "your own reference to the payload". Pasted literally
— which is the only reasonable thing to do with a line in a code block — it is
not an expression, and Power Automate says so. Shorthand in something meant to
be copied is just a wrong answer with an excuse attached.

Both real forms are now written out: the concat() for the expression editor,
and the @{ } token form for the plain Filter Query box, with a note on which
box is which. Checked against the run history rather than by eye — the concat
resolves byte for byte to the "State eq 'VIC' and ProjectId eq 1" that the 51
successful runs sent.

Co-Authored-By: Claude Opus 5 <noreply@anthropic.com>
Claude-Session: https://claude.ai/code/session_01R3SHvZxDNeDF7H2ECUwwcs
</commit_message>
<xml_diff>
--- a/docs/word/3 - Building the Flows.docx
+++ b/docs/word/3 - Building the Flows.docx
@@ -14492,26 +14492,7 @@
           <w:sz w:val="20"/>
           <w:szCs w:val="20"/>
         </w:rPr>
-        <w:t xml:space="preserve"> expression to tolerate empty values. That was the wrong end of the problem, and pasting a multi-line expression into that box leaves line breaks behind, which SharePoint rejects as </w:t>
-      </w:r>
-      <w:r>
-        <w:rPr>
-          <w:rFonts w:ascii="Consolas" w:cs="Consolas" w:eastAsia="Consolas" w:hAnsi="Consolas"/>
-          <w:color w:val="2A4258"/>
-          <w:sz w:val="18"/>
-          <w:szCs w:val="18"/>
-          <w:shd w:fill="F2F0EA" w:val="clear"/>
-        </w:rPr>
-        <w:t xml:space="preserve">The $filter expression " " is not valid</w:t>
-      </w:r>
-      <w:r>
-        <w:rPr>
-          <w:rFonts w:ascii="Arial" w:cs="Arial" w:eastAsia="Arial" w:hAnsi="Arial"/>
-          <w:color w:val="1C2B3A"/>
-          <w:sz w:val="20"/>
-          <w:szCs w:val="20"/>
-        </w:rPr>
-        <w:t xml:space="preserve">.</w:t>
+        <w:t xml:space="preserve"> expression to tolerate empty values. That was the wrong end of the problem: the app only ever sends a real state and a real project id, so the empty case never arises.</w:t>
       </w:r>
     </w:p>
     <w:p>
@@ -14525,7 +14506,7 @@
           <w:sz w:val="20"/>
           <w:szCs w:val="20"/>
         </w:rPr>
-        <w:t xml:space="preserve">The straightforward filter is correct:</w:t>
+        <w:t xml:space="preserve">It also wrote the working filter as</w:t>
       </w:r>
     </w:p>
     <w:p>
@@ -14558,7 +14539,413 @@
           <w:sz w:val="20"/>
           <w:szCs w:val="20"/>
         </w:rPr>
-        <w:t xml:space="preserve">The app only ever sends a real state and a real project id, so it never produces the empty case.</w:t>
+        <w:t xml:space="preserve">where </w:t>
+      </w:r>
+      <w:r>
+        <w:rPr>
+          <w:rFonts w:ascii="Consolas" w:cs="Consolas" w:eastAsia="Consolas" w:hAnsi="Consolas"/>
+          <w:color w:val="2A4258"/>
+          <w:sz w:val="18"/>
+          <w:szCs w:val="18"/>
+          <w:shd w:fill="F2F0EA" w:val="clear"/>
+        </w:rPr>
+        <w:t xml:space="preserve">...state</w:t>
+      </w:r>
+      <w:r>
+        <w:rPr>
+          <w:rFonts w:ascii="Arial" w:cs="Arial" w:eastAsia="Arial" w:hAnsi="Arial"/>
+          <w:color w:val="1C2B3A"/>
+          <w:sz w:val="20"/>
+          <w:szCs w:val="20"/>
+        </w:rPr>
+        <w:t xml:space="preserve"> was shorthand for </w:t>
+      </w:r>
+      <w:r>
+        <w:rPr>
+          <w:rFonts w:ascii="Arial" w:cs="Arial" w:eastAsia="Arial" w:hAnsi="Arial"/>
+          <w:i/>
+          <w:iCs/>
+          <w:color w:val="1C2B3A"/>
+          <w:sz w:val="20"/>
+          <w:szCs w:val="20"/>
+        </w:rPr>
+        <w:t xml:space="preserve">your own reference to the payload</w:t>
+      </w:r>
+      <w:r>
+        <w:rPr>
+          <w:rFonts w:ascii="Arial" w:cs="Arial" w:eastAsia="Arial" w:hAnsi="Arial"/>
+          <w:color w:val="1C2B3A"/>
+          <w:sz w:val="20"/>
+          <w:szCs w:val="20"/>
+        </w:rPr>
+        <w:t xml:space="preserve">. Pasted literally, that is not an expression and Power Automate says so: </w:t>
+      </w:r>
+      <w:r>
+        <w:rPr>
+          <w:rFonts w:ascii="Arial" w:cs="Arial" w:eastAsia="Arial" w:hAnsi="Arial"/>
+          <w:b/>
+          <w:bCs/>
+          <w:color w:val="1C2B3A"/>
+          <w:sz w:val="20"/>
+          <w:szCs w:val="20"/>
+        </w:rPr>
+        <w:t xml:space="preserve">"This expression has a problem."</w:t>
+      </w:r>
+      <w:r>
+        <w:rPr>
+          <w:rFonts w:ascii="Arial" w:cs="Arial" w:eastAsia="Arial" w:hAnsi="Arial"/>
+          <w:color w:val="1C2B3A"/>
+          <w:sz w:val="20"/>
+          <w:szCs w:val="20"/>
+        </w:rPr>
+        <w:t xml:space="preserve"> Written out properly it is one of these two, depending on which box you are typing into.</w:t>
+      </w:r>
+    </w:p>
+    <w:p>
+      <w:pPr>
+        <w:spacing w:after="160" w:line="276"/>
+      </w:pPr>
+      <w:r>
+        <w:rPr>
+          <w:rFonts w:ascii="Arial" w:cs="Arial" w:eastAsia="Arial" w:hAnsi="Arial"/>
+          <w:b/>
+          <w:bCs/>
+          <w:color w:val="1C2B3A"/>
+          <w:sz w:val="20"/>
+          <w:szCs w:val="20"/>
+        </w:rPr>
+        <w:t xml:space="preserve">In the expression editor (the </w:t>
+      </w:r>
+      <w:r>
+        <w:rPr>
+          <w:rFonts w:ascii="Consolas" w:cs="Consolas" w:eastAsia="Consolas" w:hAnsi="Consolas"/>
+          <w:b/>
+          <w:bCs/>
+          <w:color w:val="2A4258"/>
+          <w:sz w:val="18"/>
+          <w:szCs w:val="18"/>
+          <w:shd w:fill="F2F0EA" w:val="clear"/>
+        </w:rPr>
+        <w:t xml:space="preserve">fx</w:t>
+      </w:r>
+      <w:r>
+        <w:rPr>
+          <w:rFonts w:ascii="Arial" w:cs="Arial" w:eastAsia="Arial" w:hAnsi="Arial"/>
+          <w:b/>
+          <w:bCs/>
+          <w:color w:val="1C2B3A"/>
+          <w:sz w:val="20"/>
+          <w:szCs w:val="20"/>
+        </w:rPr>
+        <w:t xml:space="preserve"> button)</w:t>
+      </w:r>
+      <w:r>
+        <w:rPr>
+          <w:rFonts w:ascii="Arial" w:cs="Arial" w:eastAsia="Arial" w:hAnsi="Arial"/>
+          <w:color w:val="1C2B3A"/>
+          <w:sz w:val="20"/>
+          <w:szCs w:val="20"/>
+        </w:rPr>
+        <w:t xml:space="preserve"> — paste this, as one line:</w:t>
+      </w:r>
+    </w:p>
+    <w:p>
+      <w:pPr>
+        <w:pBdr>
+          <w:left w:val="single" w:color="4C5C6D" w:sz="12" w:space="8"/>
+        </w:pBdr>
+        <w:shd w:fill="F2F0EA" w:val="clear"/>
+        <w:spacing w:after="160" w:before="120"/>
+        <w:ind w:left="220" w:right="220"/>
+      </w:pPr>
+      <w:r>
+        <w:rPr>
+          <w:rFonts w:ascii="Consolas" w:cs="Consolas" w:eastAsia="Consolas" w:hAnsi="Consolas"/>
+          <w:color w:val="1C2B3A"/>
+          <w:sz w:val="17"/>
+          <w:szCs w:val="17"/>
+        </w:rPr>
+        <w:t xml:space="preserve">concat('State eq ''', outputs('Payload')?['state'], ''' and ProjectId eq ', outputs('Payload')?['projectId'])</w:t>
+      </w:r>
+    </w:p>
+    <w:p>
+      <w:pPr>
+        <w:spacing w:after="160" w:line="276"/>
+      </w:pPr>
+      <w:r>
+        <w:rPr>
+          <w:rFonts w:ascii="Arial" w:cs="Arial" w:eastAsia="Arial" w:hAnsi="Arial"/>
+          <w:b/>
+          <w:bCs/>
+          <w:color w:val="1C2B3A"/>
+          <w:sz w:val="20"/>
+          <w:szCs w:val="20"/>
+        </w:rPr>
+        <w:t xml:space="preserve">In the plain Filter Query box</w:t>
+      </w:r>
+      <w:r>
+        <w:rPr>
+          <w:rFonts w:ascii="Arial" w:cs="Arial" w:eastAsia="Arial" w:hAnsi="Arial"/>
+          <w:color w:val="1C2B3A"/>
+          <w:sz w:val="20"/>
+          <w:szCs w:val="20"/>
+        </w:rPr>
+        <w:t xml:space="preserve">, without opening the expression editor — the </w:t>
+      </w:r>
+      <w:r>
+        <w:rPr>
+          <w:rFonts w:ascii="Consolas" w:cs="Consolas" w:eastAsia="Consolas" w:hAnsi="Consolas"/>
+          <w:color w:val="2A4258"/>
+          <w:sz w:val="18"/>
+          <w:szCs w:val="18"/>
+          <w:shd w:fill="F2F0EA" w:val="clear"/>
+        </w:rPr>
+        <w:t xml:space="preserve">@{ }</w:t>
+      </w:r>
+      <w:r>
+        <w:rPr>
+          <w:rFonts w:ascii="Arial" w:cs="Arial" w:eastAsia="Arial" w:hAnsi="Arial"/>
+          <w:color w:val="1C2B3A"/>
+          <w:sz w:val="20"/>
+          <w:szCs w:val="20"/>
+        </w:rPr>
+        <w:t xml:space="preserve"> wrapper is what marks an expression inside ordinary text:</w:t>
+      </w:r>
+    </w:p>
+    <w:p>
+      <w:pPr>
+        <w:pBdr>
+          <w:left w:val="single" w:color="4C5C6D" w:sz="12" w:space="8"/>
+        </w:pBdr>
+        <w:shd w:fill="F2F0EA" w:val="clear"/>
+        <w:spacing w:after="160" w:before="120"/>
+        <w:ind w:left="220" w:right="220"/>
+      </w:pPr>
+      <w:r>
+        <w:rPr>
+          <w:rFonts w:ascii="Consolas" w:cs="Consolas" w:eastAsia="Consolas" w:hAnsi="Consolas"/>
+          <w:color w:val="1C2B3A"/>
+          <w:sz w:val="17"/>
+          <w:szCs w:val="17"/>
+        </w:rPr>
+        <w:t xml:space="preserve">State eq '@{outputs('Payload')?['state']}' and ProjectId eq @{outputs('Payload')?['projectId']}</w:t>
+      </w:r>
+    </w:p>
+    <w:p>
+      <w:pPr>
+        <w:spacing w:after="160" w:line="276"/>
+      </w:pPr>
+      <w:r>
+        <w:rPr>
+          <w:rFonts w:ascii="Arial" w:cs="Arial" w:eastAsia="Arial" w:hAnsi="Arial"/>
+          <w:color w:val="1C2B3A"/>
+          <w:sz w:val="20"/>
+          <w:szCs w:val="20"/>
+        </w:rPr>
+        <w:t xml:space="preserve">Either produces </w:t>
+      </w:r>
+      <w:r>
+        <w:rPr>
+          <w:rFonts w:ascii="Consolas" w:cs="Consolas" w:eastAsia="Consolas" w:hAnsi="Consolas"/>
+          <w:color w:val="2A4258"/>
+          <w:sz w:val="18"/>
+          <w:szCs w:val="18"/>
+          <w:shd w:fill="F2F0EA" w:val="clear"/>
+        </w:rPr>
+        <w:t xml:space="preserve">State eq 'VIC' and ProjectId eq 1</w:t>
+      </w:r>
+      <w:r>
+        <w:rPr>
+          <w:rFonts w:ascii="Arial" w:cs="Arial" w:eastAsia="Arial" w:hAnsi="Arial"/>
+          <w:color w:val="1C2B3A"/>
+          <w:sz w:val="20"/>
+          <w:szCs w:val="20"/>
+        </w:rPr>
+        <w:t xml:space="preserve">, which is exactly what the successful runs in the history sent.</w:t>
+      </w:r>
+    </w:p>
+    <w:p>
+      <w:pPr>
+        <w:spacing w:after="160" w:line="276"/>
+      </w:pPr>
+      <w:r>
+        <w:rPr>
+          <w:rFonts w:ascii="Arial" w:cs="Arial" w:eastAsia="Arial" w:hAnsi="Arial"/>
+          <w:color w:val="1C2B3A"/>
+          <w:sz w:val="20"/>
+          <w:szCs w:val="20"/>
+        </w:rPr>
+        <w:t xml:space="preserve">Two things to match to your own flow:</w:t>
+      </w:r>
+    </w:p>
+    <w:p>
+      <w:pPr>
+        <w:pStyle w:val="ListParagraph"/>
+        <w:numPr>
+          <w:ilvl w:val="0"/>
+          <w:numId w:val="2"/>
+        </w:numPr>
+        <w:spacing w:after="80"/>
+      </w:pPr>
+      <w:r>
+        <w:rPr>
+          <w:rFonts w:ascii="Consolas" w:cs="Consolas" w:eastAsia="Consolas" w:hAnsi="Consolas"/>
+          <w:b/>
+          <w:bCs/>
+          <w:color w:val="2A4258"/>
+          <w:sz w:val="18"/>
+          <w:szCs w:val="18"/>
+          <w:shd w:fill="F2F0EA" w:val="clear"/>
+        </w:rPr>
+        <w:t xml:space="preserve">Payload</w:t>
+      </w:r>
+      <w:r>
+        <w:rPr>
+          <w:rFonts w:ascii="Arial" w:cs="Arial" w:eastAsia="Arial" w:hAnsi="Arial"/>
+          <w:color w:val="1C2B3A"/>
+          <w:sz w:val="20"/>
+          <w:szCs w:val="20"/>
+        </w:rPr>
+        <w:t xml:space="preserve"> is the name of the action that parses the incoming JSON. If it is a </w:t>
+      </w:r>
+      <w:r>
+        <w:rPr>
+          <w:rFonts w:ascii="Arial" w:cs="Arial" w:eastAsia="Arial" w:hAnsi="Arial"/>
+          <w:b/>
+          <w:bCs/>
+          <w:color w:val="1C2B3A"/>
+          <w:sz w:val="20"/>
+          <w:szCs w:val="20"/>
+        </w:rPr>
+        <w:t xml:space="preserve">Compose</w:t>
+      </w:r>
+      <w:r>
+        <w:rPr>
+          <w:rFonts w:ascii="Arial" w:cs="Arial" w:eastAsia="Arial" w:hAnsi="Arial"/>
+          <w:color w:val="1C2B3A"/>
+          <w:sz w:val="20"/>
+          <w:szCs w:val="20"/>
+        </w:rPr>
+        <w:t xml:space="preserve">, </w:t>
+      </w:r>
+      <w:r>
+        <w:rPr>
+          <w:rFonts w:ascii="Consolas" w:cs="Consolas" w:eastAsia="Consolas" w:hAnsi="Consolas"/>
+          <w:color w:val="2A4258"/>
+          <w:sz w:val="18"/>
+          <w:szCs w:val="18"/>
+          <w:shd w:fill="F2F0EA" w:val="clear"/>
+        </w:rPr>
+        <w:t xml:space="preserve">outputs('Payload')</w:t>
+      </w:r>
+      <w:r>
+        <w:rPr>
+          <w:rFonts w:ascii="Arial" w:cs="Arial" w:eastAsia="Arial" w:hAnsi="Arial"/>
+          <w:color w:val="1C2B3A"/>
+          <w:sz w:val="20"/>
+          <w:szCs w:val="20"/>
+        </w:rPr>
+        <w:t xml:space="preserve"> is right; if it is a </w:t>
+      </w:r>
+      <w:r>
+        <w:rPr>
+          <w:rFonts w:ascii="Arial" w:cs="Arial" w:eastAsia="Arial" w:hAnsi="Arial"/>
+          <w:b/>
+          <w:bCs/>
+          <w:color w:val="1C2B3A"/>
+          <w:sz w:val="20"/>
+          <w:szCs w:val="20"/>
+        </w:rPr>
+        <w:t xml:space="preserve">Parse JSON</w:t>
+      </w:r>
+      <w:r>
+        <w:rPr>
+          <w:rFonts w:ascii="Arial" w:cs="Arial" w:eastAsia="Arial" w:hAnsi="Arial"/>
+          <w:color w:val="1C2B3A"/>
+          <w:sz w:val="20"/>
+          <w:szCs w:val="20"/>
+        </w:rPr>
+        <w:t xml:space="preserve">, use </w:t>
+      </w:r>
+      <w:r>
+        <w:rPr>
+          <w:rFonts w:ascii="Consolas" w:cs="Consolas" w:eastAsia="Consolas" w:hAnsi="Consolas"/>
+          <w:color w:val="2A4258"/>
+          <w:sz w:val="18"/>
+          <w:szCs w:val="18"/>
+          <w:shd w:fill="F2F0EA" w:val="clear"/>
+        </w:rPr>
+        <w:t xml:space="preserve">body('Payload')</w:t>
+      </w:r>
+      <w:r>
+        <w:rPr>
+          <w:rFonts w:ascii="Arial" w:cs="Arial" w:eastAsia="Arial" w:hAnsi="Arial"/>
+          <w:color w:val="1C2B3A"/>
+          <w:sz w:val="20"/>
+          <w:szCs w:val="20"/>
+        </w:rPr>
+        <w:t xml:space="preserve">.</w:t>
+      </w:r>
+    </w:p>
+    <w:p>
+      <w:pPr>
+        <w:pStyle w:val="ListParagraph"/>
+        <w:numPr>
+          <w:ilvl w:val="0"/>
+          <w:numId w:val="2"/>
+        </w:numPr>
+        <w:spacing w:after="80"/>
+      </w:pPr>
+      <w:r>
+        <w:rPr>
+          <w:rFonts w:ascii="Consolas" w:cs="Consolas" w:eastAsia="Consolas" w:hAnsi="Consolas"/>
+          <w:b/>
+          <w:bCs/>
+          <w:color w:val="2A4258"/>
+          <w:sz w:val="18"/>
+          <w:szCs w:val="18"/>
+          <w:shd w:fill="F2F0EA" w:val="clear"/>
+        </w:rPr>
+        <w:t xml:space="preserve">ProjectId</w:t>
+      </w:r>
+      <w:r>
+        <w:rPr>
+          <w:rFonts w:ascii="Arial" w:cs="Arial" w:eastAsia="Arial" w:hAnsi="Arial"/>
+          <w:b/>
+          <w:bCs/>
+          <w:color w:val="1C2B3A"/>
+          <w:sz w:val="20"/>
+          <w:szCs w:val="20"/>
+        </w:rPr>
+        <w:t xml:space="preserve"> is a Number column</w:t>
+      </w:r>
+      <w:r>
+        <w:rPr>
+          <w:rFonts w:ascii="Arial" w:cs="Arial" w:eastAsia="Arial" w:hAnsi="Arial"/>
+          <w:color w:val="1C2B3A"/>
+          <w:sz w:val="20"/>
+          <w:szCs w:val="20"/>
+        </w:rPr>
+        <w:t xml:space="preserve"> here, so its value is not quoted, while </w:t>
+      </w:r>
+      <w:r>
+        <w:rPr>
+          <w:rFonts w:ascii="Consolas" w:cs="Consolas" w:eastAsia="Consolas" w:hAnsi="Consolas"/>
+          <w:color w:val="2A4258"/>
+          <w:sz w:val="18"/>
+          <w:szCs w:val="18"/>
+          <w:shd w:fill="F2F0EA" w:val="clear"/>
+        </w:rPr>
+        <w:t xml:space="preserve">State</w:t>
+      </w:r>
+      <w:r>
+        <w:rPr>
+          <w:rFonts w:ascii="Arial" w:cs="Arial" w:eastAsia="Arial" w:hAnsi="Arial"/>
+          <w:color w:val="1C2B3A"/>
+          <w:sz w:val="20"/>
+          <w:szCs w:val="20"/>
+        </w:rPr>
+        <w:t xml:space="preserve"> is text and is. The tripled quotes around the text value are not a typo — a single quote inside a Power Automate string literal is written by doubling it.</w:t>
       </w:r>
     </w:p>
     <w:p>

</xml_diff>